<commit_message>
R2: reconcile neonatal denominators and finalize revised documents
</commit_message>
<xml_diff>
--- a/Carta de Respuesta.docx
+++ b/Carta de Respuesta.docx
@@ -1119,7 +1119,7 @@
         </w:numPr>
       </w:pPr>
       <w:r>
-        <w:t xml:space="preserve">La sensibilidad con umbrales de 2, 3 y 4 semanas produjo, respectivamente, 146, 152 y 152 registros consolidados (7.041, 7.035 y 7.035 eventos finales). Por tanto, el resultado principal de 152 consolidaciones fue idéntico con cuatro semanas y difirió en seis eventos con la regla más estricta de dos semanas. Los resultados se conservan en</w:t>
+        <w:t xml:space="preserve">La sensibilidad incluyó cuatro especificaciones: llave exacta y tolerancias de 1, 2 y 3 semanas. La llave exacta consolidó 139 registros y produjo 7.048 eventos obstétricos finales; la tolerancia de una semana consolidó 140 registros y produjo 7.047 eventos; la de dos semanas consolidó 146 registros y produjo 7.041 eventos; y la regla principal de tres semanas consolidó 152 registros y produjo 7.035 eventos finales. Los eventos clasificados como embarazos múltiples fueron 258, 257, 251 y 245, respectivamente. Por tanto, la muestra principal de 7.035 eventos corresponde específicamente a la regla de tres semanas. Los resultados reproducibles se encuentran en</w:t>
       </w:r>
       <w:r>
         <w:t xml:space="preserve"> </w:t>
@@ -1128,7 +1128,7 @@
         <w:rPr>
           <w:rStyle w:val="VerbatimChar"/>
         </w:rPr>
-        <w:t xml:space="preserve">output/reconciliation/sensibilidad_linkage.csv</w:t>
+        <w:t xml:space="preserve">output/reconciliation/sensibilidad_linkage_CORREGIDA.csv</w:t>
       </w:r>
       <w:r>
         <w:t xml:space="preserve">.</w:t>
@@ -1143,7 +1143,7 @@
         </w:numPr>
       </w:pPr>
       <w:r>
-        <w:t xml:space="preserve">Este método asegura que no se sobrecuenten gestaciones múltiples en el análisis materno y que la muestra resultante sea consistente con la unidad de análisis declarada.</w:t>
+        <w:t xml:space="preserve">El procedimiento redujo el sobreconteo atribuible a registros múltiples y produjo una muestra consistente con la unidad de análisis definida; no obstante, debido a la ausencia de un identificador único y al carácter determinístico del linkage, no puede excluirse completamente clasificación residual.</w:t>
       </w:r>
     </w:p>
     <w:bookmarkEnd w:id="21"/>

</xml_diff>